<commit_message>
Move defensive and design-rationale prose out of Results into the supplement
Results mixed three kinds of sentence: findings, defences of findings
(why no p-value, what a bootstrap shows, rounding conventions), and
design justification (why E. coli rather than M. tuberculosis, why a
given deposit is a harder test). Moved the second and third kinds to
the supplement, where they read as expected rigor rather than as
padding in the main narrative. No content was deleted, only relocated;
the same <!--supp--> paragraph marker the build script already reads
was used throughout.

Fixed one citation that briefly lost its only main-text reference to
Table 3 as a result of the move.

Main text word count: 10,341 -> 9,747. Full chain rebuilt clean.
</commit_message>
<xml_diff>
--- a/Results_for_review.docx
+++ b/Results_for_review.docx
@@ -33,7 +33,7 @@
     </w:p>
     <w:p>
       <w:r>
-        <w:t>Each isolate therefore carries a fixed budget of killing the assay can see. At 15 days of prior culture the starting densities run from 2,300 to 61,000,000 per mL (3.36 to 7.79 log10), so headroom, the distance from the starting density down to the floor, runs from 2.00 to 6.42 log10 (Fig. 1B, Table 1): both spans are the same 4.42 log10. Every log10 here is computed from the raw MPN rungs against a floor of 23 per mL and rounded once, at the end, so the deepest headroom displays as 6.42 rather than as the 6.43 that 7.79 minus 1.36 returns; the fold figures quoted throughout are likewise ten raised to the unrounded difference.</w:t>
+        <w:t>Each isolate therefore carries a fixed budget of killing the assay can see. At 15 days of prior culture the starting densities run from 2,300 to 61,000,000 per mL (3.36 to 7.79 log10), so headroom, the distance from the starting density down to the floor, runs from 2.00 to 6.42 log10 (Fig. 1B, Table 1): both spans are the same 4.42 log10.</w:t>
       </w:r>
     </w:p>
     <w:p>
@@ -47,7 +47,7 @@
         <w:t>Thirty-three of 217 isolates (15.2 per cent) lack the headroom for the 99.99 per cent endpoint</w:t>
       </w:r>
       <w:r>
-        <w:t>, a four-log reduction that was unobservable for them before rifampicin was added. Two of those 33 carry a fourth label the deposit writes literally as "MDR" (conventionally multidrug-resistant), unordered with respect to the other three, so no ordered analysis can place it (Table S2); over the 203 isolates with an ordered label the count is 31.</w:t>
+        <w:t>, a four-log reduction that was unobservable for them before rifampicin was added.</w:t>
       </w:r>
     </w:p>
     <w:p>
@@ -61,16 +61,7 @@
         <w:t>assay ceiling</w:t>
       </w:r>
       <w:r>
-        <w:t xml:space="preserve">, a census rather than an estimate. The ceiling is a different censoring mechanism from the floor: the floor censors the count (anything below </w:t>
-      </w:r>
-      <w:r>
-        <w:rPr>
-          <w:i/>
-        </w:rPr>
-        <w:t>L</w:t>
-      </w:r>
-      <w:r>
-        <w:t xml:space="preserve"> is not reported as a count), the ceiling censors time (the assay runs six days, so an isolate that has not reached its endpoint by then is recorded at the last day rather than the day it would have reached). One sets how deep the assay can see, the other how long it looks. Among the 184 isolates that did have four logs of headroom, 162 are also at the ceiling, 88.0 per cent.</w:t>
+        <w:t>: a census rather than an estimate, since the floor censors the count while the ceiling censors time, an isolate not yet at its endpoint after six days being recorded at the last day rather than the day it would have reached. Among the 184 isolates that did have four logs of headroom, 162 are also at the ceiling, 88.0 per cent.</w:t>
       </w:r>
     </w:p>
     <w:p>
@@ -87,7 +78,7 @@
     </w:p>
     <w:p>
       <w:r>
-        <w:t>The deposited tolerance level is a cut-off on the recorded surviving fraction, with no overlap between classes. The thresholds themselves are not deposited; recovered here, at day 5 and 15 days of prior culture, low tolerance covers fractions below 10⁻³, medium 10⁻³ to 10⁻², high above 10⁻². Those cuts reproduce every usable class in the file, 203 of 203 (Table S3). Usable means the 203 of 217 isolates whose label is one of the three ordered classes; the other 14 carry the "MDR" category, which no ordered analysis can place (Table S2). What follows is an argument about the fraction the assay recorded, not about an independent clinical judgement.</w:t>
+        <w:t>The deposited tolerance level is a cut-off on the recorded surviving fraction, with no overlap between classes. The thresholds themselves are not deposited; recovered here, at day 5 and 15 days of prior culture, low tolerance covers fractions below 10⁻³, medium 10⁻³ to 10⁻², high above 10⁻². Those cuts reproduce every usable class in the file, 203 of 203 (Table S2). Usable means the 203 of 217 isolates whose label is one of the three ordered classes; the other 14 carry the "MDR" category, which no ordered analysis can place (Table S3). What follows is an argument about the fraction the assay recorded, not about an independent clinical judgement.</w:t>
       </w:r>
     </w:p>
     <w:p>
@@ -179,29 +170,6 @@
     <w:p>
       <w:r>
         <w:t>Neither boundary predicts which isolates reach the floor; that depends on what rifampicin does. Both predict what a reading at the floor can be made to mean once it happens, and there the agreement with the deposit is exact, isolate by isolate: the set the algebra says has a single compatible class and the set the deposit records in the lowest class are the same set.</w:t>
-      </w:r>
-    </w:p>
-    <w:p>
-      <w:r>
-        <w:t xml:space="preserve">That agreement is an identity rather than a passed test. Once the label is a cut on the recorded fraction (Table S3) and every floor reading has a numerator of exactly </w:t>
-      </w:r>
-      <w:r>
-        <w:rPr>
-          <w:i/>
-        </w:rPr>
-        <w:t>L</w:t>
-      </w:r>
-      <w:r>
-        <w:t xml:space="preserve">, the class of a floored isolate is a function of </w:t>
-      </w:r>
-      <w:r>
-        <w:rPr>
-          <w:i/>
-        </w:rPr>
-        <w:t>N₀</w:t>
-      </w:r>
-      <w:r>
-        <w:t xml:space="preserve"> alone, so the algebra cannot disagree with the deposit. What could have failed, and did not, is the premise: that the three classes separate cleanly on the recorded fraction at all, in 203 of 203 calls.</w:t>
       </w:r>
     </w:p>
     <w:p>
@@ -305,7 +273,7 @@
         <w:t>isoniazid resistance</w:t>
       </w:r>
       <w:r>
-        <w:t>, until starting density enters the model. Unadjusted, a resistant isolate has 2.32 times the odds of a higher tolerance class (1.30 to 4.12, p = 0.0042); adjusted, the odds ratio falls to 1.31 (0.67 to 2.57, p = 0.42), and the interval no longer excludes one. The unadjusted 2.32 is the total effect of resistance on the label; the adjusted 1.31 is the controlled direct effect with the inoculum held fixed, under an assumption this deposit cannot test on its own, that starting density sits on the causal path as a mediator rather than beside it as a confounder. The reverse reading is equally available a priori: if slow growth both thins the inoculum and causes genuine tolerance, adjusting for starting density would remove real signal rather than a confounder (Discussion weighs the two readings against each other). What is not in question, whichever reading is right, is that the association weakens once starting density enters the model. Starting density is the strongest term in the file: every ten-fold rise in the starting MPN halves the odds of a higher tolerance class (OR 0.480, 0.340 to 0.677, p = 2.9 × 10⁻⁵).</w:t>
+        <w:t>, until starting density enters the model. Unadjusted, a resistant isolate has 2.32 times the odds of a higher tolerance class (1.30 to 4.12, p = 0.0042); adjusted, the odds ratio falls to 1.31 (0.67 to 2.57, p = 0.42), and the interval no longer excludes one. Starting density is the strongest term in the file: every ten-fold rise in the starting MPN halves the odds of a higher tolerance class (OR 0.480, 0.340 to 0.677, p = 2.9 × 10⁻⁵).</w:t>
       </w:r>
     </w:p>
     <w:p>
@@ -337,7 +305,7 @@
     </w:p>
     <w:p>
       <w:r>
-        <w:t>At ten times the minimum inhibitory concentration of moxifloxacin all six laboratories return a positive kill rate, spanning 5.2-fold, from 0.090 to 0.464 log10 CFU/mL per day. Across all 30 laboratory-by-arm cells the Tobit estimate and the imputation estimate never differ by more than 0.006 log10 per day (Fig. 2A, Table S5), which says the fit is not an artefact of the arithmetic used to reach it, not that the sub-floor assumption is safe: both estimators assume the same normal distribution below the floor, and nothing here can check that from the inside.</w:t>
+        <w:t>At ten times the minimum inhibitory concentration of moxifloxacin all six laboratories return a positive kill rate, spanning 5.2-fold, from 0.090 to 0.464 log10 CFU/mL per day (Fig. 2A, Table S5).</w:t>
       </w:r>
     </w:p>
     <w:p>
@@ -355,29 +323,6 @@
           <w:sz w:val="22"/>
         </w:rPr>
         <w:t>6. The same boundaries hold in an experiment the framework never saw</w:t>
-      </w:r>
-    </w:p>
-    <w:p>
-      <w:r>
-        <w:t xml:space="preserve">Only one deposit was opened after every boundary and threshold was fixed. That it is </w:t>
-      </w:r>
-      <w:r>
-        <w:rPr>
-          <w:i/>
-        </w:rPr>
-        <w:t>E. coli</w:t>
-      </w:r>
-      <w:r>
-        <w:t xml:space="preserve"> in a hollow-fibre system rather than </w:t>
-      </w:r>
-      <w:r>
-        <w:rPr>
-          <w:i/>
-        </w:rPr>
-        <w:t>M. tuberculosis</w:t>
-      </w:r>
-      <w:r>
-        <w:t xml:space="preserve"> in a flask makes it a harder test, not a softer one: a rule fitted to tuberculosis time-kill data could be expected to fit more of it; what it has no right to survive is a different organism, drug class and apparatus. The boundaries are derived from definitions, so they predict they will.</w:t>
       </w:r>
     </w:p>
     <w:p>
@@ -528,47 +473,6 @@
       </w:r>
       <w:r>
         <w:t xml:space="preserve"> ATCC 25922, the reference strain the standard names for quality control, against ciprofloxacin at ten times the concentration that stops it growing. Three seeding densities, two plated volumes, three flasks each, 216 plate readings.</w:t>
-      </w:r>
-    </w:p>
-    <w:p>
-      <w:r>
-        <w:t xml:space="preserve">It is </w:t>
-      </w:r>
-      <w:r>
-        <w:rPr>
-          <w:i/>
-        </w:rPr>
-        <w:t>Escherichia coli</w:t>
-      </w:r>
-      <w:r>
-        <w:t xml:space="preserve"> and not </w:t>
-      </w:r>
-      <w:r>
-        <w:rPr>
-          <w:i/>
-        </w:rPr>
-        <w:t>M. tuberculosis</w:t>
-      </w:r>
-      <w:r>
-        <w:t xml:space="preserve"> by design, not convenience. Reachability and identifiability are arithmetic on a plated volume, so they do not know what organism is on the plate; what an organism decides is whether the experiment can be run at all. Three seeding densities crossed with two plated volumes and six sampling times is 216 plates that must be counted from one exposure, and in </w:t>
-      </w:r>
-      <w:r>
-        <w:rPr>
-          <w:i/>
-        </w:rPr>
-        <w:t>M. tuberculosis</w:t>
-      </w:r>
-      <w:r>
-        <w:t xml:space="preserve"> that means three to six weeks to colonies, inside containment, per replicate. Ciprofloxacin drives </w:t>
-      </w:r>
-      <w:r>
-        <w:rPr>
-          <w:i/>
-        </w:rPr>
-        <w:t>E. coli</w:t>
-      </w:r>
-      <w:r>
-        <w:t xml:space="preserve"> to the floor within a working day, which makes the floor reachable in every arm and the prediction falsifiable in a week rather than a year. ATCC 25922 is the quality-control reference strain the standard itself names, so the demonstration runs in the one organism whose assay geometry the standard defines.</w:t>
       </w:r>
     </w:p>
     <w:p>

</xml_diff>